<commit_message>
penambahan dokumen baru v3
</commit_message>
<xml_diff>
--- a/storage/app/templates/ginou/reports/form_1_23_pengajuan_rekom.docx
+++ b/storage/app/templates/ginou/reports/form_1_23_pengajuan_rekom.docx
@@ -234,7 +234,26 @@
                 <w:szCs w:val="24"/>
               </w:rPr>
               <w:tab/>
-              <w:t>: ${interview_title}/SPM/OG/${doc_bulan_romawi}/</w:t>
+              <w:t>: ${</w:t>
+            </w:r>
+            <w:r>
+              <w:t xml:space="preserve"> </w:t>
+            </w:r>
+            <w:r>
+              <w:rPr>
+                <w:color w:val="000000"/>
+                <w:sz w:val="24"/>
+                <w:szCs w:val="24"/>
+              </w:rPr>
+              <w:t>id_interview</w:t>
+            </w:r>
+            <w:r>
+              <w:rPr>
+                <w:color w:val="000000"/>
+                <w:sz w:val="24"/>
+                <w:szCs w:val="24"/>
+              </w:rPr>
+              <w:t>}/SPM/OG/${doc_bulan_romawi}/</w:t>
             </w:r>
             <w:r>
               <w:rPr>

</xml_diff>

<commit_message>
penambahan dokumen baru v10
</commit_message>
<xml_diff>
--- a/storage/app/templates/ginou/reports/form_1_23_pengajuan_rekom.docx
+++ b/storage/app/templates/ginou/reports/form_1_23_pengajuan_rekom.docx
@@ -859,7 +859,39 @@
           <w:sz w:val="24"/>
           <w:szCs w:val="24"/>
         </w:rPr>
-        <w:t>LAMPIRAN : ${interview_title}/SPM/OG/${doc_bulan_romawi}/2026.</w:t>
+        <w:t xml:space="preserve">LAMPIRAN : </w:t>
+      </w:r>
+      <w:r>
+        <w:rPr>
+          <w:color w:val="000000"/>
+          <w:sz w:val="24"/>
+          <w:szCs w:val="24"/>
+        </w:rPr>
+        <w:t>${</w:t>
+      </w:r>
+      <w:r>
+        <w:rPr>
+          <w:color w:val="000000"/>
+          <w:sz w:val="24"/>
+          <w:szCs w:val="24"/>
+        </w:rPr>
+        <w:t>id_interview</w:t>
+      </w:r>
+      <w:r>
+        <w:rPr>
+          <w:color w:val="000000"/>
+          <w:sz w:val="24"/>
+          <w:szCs w:val="24"/>
+        </w:rPr>
+        <w:t>}/</w:t>
+      </w:r>
+      <w:r>
+        <w:rPr>
+          <w:color w:val="000000"/>
+          <w:sz w:val="24"/>
+          <w:szCs w:val="24"/>
+        </w:rPr>
+        <w:t>SPM/OG/${doc_bulan_romawi}/2026.</w:t>
       </w:r>
     </w:p>
     <w:p>
@@ -885,8 +917,8 @@
         <w:tblLook w:val="04A0" w:firstRow="1" w:lastRow="0" w:firstColumn="1" w:lastColumn="0" w:noHBand="0" w:noVBand="1"/>
       </w:tblPr>
       <w:tblGrid>
-        <w:gridCol w:w="600"/>
-        <w:gridCol w:w="8760"/>
+        <w:gridCol w:w="732"/>
+        <w:gridCol w:w="8628"/>
       </w:tblGrid>
       <w:tr>
         <w:tc>
@@ -980,6 +1012,12 @@
             <w:pPr>
               <w:spacing w:line="276" w:lineRule="auto"/>
             </w:pPr>
+            <w:r>
+              <w:rPr>
+                <w:szCs w:val="21"/>
+              </w:rPr>
+              <w:t>${no}</w:t>
+            </w:r>
           </w:p>
         </w:tc>
         <w:tc>
@@ -1001,7 +1039,14 @@
           <w:p>
             <w:pPr>
               <w:spacing w:line="276" w:lineRule="auto"/>
-            </w:pPr>
+              <w:jc w:val="center"/>
+            </w:pPr>
+            <w:r>
+              <w:rPr>
+                <w:szCs w:val="21"/>
+              </w:rPr>
+              <w:t>${nama_siswa}</w:t>
+            </w:r>
           </w:p>
         </w:tc>
       </w:tr>

</xml_diff>